<commit_message>
data: freeze accepted MVP human anchors
</commit_message>
<xml_diff>
--- a/packages/test-fixtures/docx/3、星辰建设集团南山科技园项目二标段土建总承包工程合同_缩减版.docx
+++ b/packages/test-fixtures/docx/3、星辰建设集团南山科技园项目二标段土建总承包工程合同_缩减版.docx
@@ -3113,14 +3113,16 @@
       </w:r>
       <w:r>
         <w:rPr>
-          <w:rFonts w:ascii="宋体" w:hAnsi="宋体" w:cs="宋体" w:hint="eastAsia"/>
+          <w:rFonts w:ascii="宋体" w:hAnsi="宋体" w:cs="宋体"/>
+          <w:b/>
+          <w:bCs/>
           <w:iCs/>
           <w:sz w:val="21"/>
           <w:szCs w:val="21"/>
           <w:u w:val="single"/>
           <w:shd w:val="clear" w:color="auto" w:fill="D9D9D9"/>
         </w:rPr>
-        <w:t>捌仟捌佰肆拾捌元整</w:t>
+        <w:t>壹万贰仟捌佰元整</w:t>
       </w:r>
       <w:r>
         <w:rPr>
@@ -3131,7 +3133,7 @@
           <w:u w:val="single"/>
           <w:shd w:val="clear" w:color="auto" w:fill="D9D9D9"/>
         </w:rPr>
-        <w:t>      </w:t>
+        <w:t xml:space="preserve">   </w:t>
       </w:r>
       <w:r>
         <w:rPr>
@@ -5613,7 +5615,15 @@
                 <w:sz w:val="21"/>
                 <w:szCs w:val="21"/>
               </w:rPr>
-              <w:t>三标段</w:t>
+              <w:t>二</w:t>
+            </w:r>
+            <w:r>
+              <w:rPr>
+                <w:rFonts w:ascii="宋体" w:hAnsi="宋体" w:cs="宋体" w:hint="eastAsia"/>
+                <w:sz w:val="21"/>
+                <w:szCs w:val="21"/>
+              </w:rPr>
+              <w:t>标段</w:t>
             </w:r>
           </w:p>
         </w:tc>
@@ -11225,7 +11235,7 @@
           <w:sz w:val="48"/>
           <w:szCs w:val="48"/>
         </w:rPr>
-        <w:t>三</w:t>
+        <w:t>二</w:t>
       </w:r>
       <w:r>
         <w:rPr>
@@ -12107,7 +12117,7 @@
               <v:stroke joinstyle="miter"/>
               <v:path gradientshapeok="t" o:connecttype="rect"/>
             </v:shapetype>
-            <v:shape id="文本框 4" o:spid="_x0000_s1026" type="#_x0000_t202" style="position:absolute;left:0;text-align:left;margin-left:0;margin-top:0;width:2in;height:2in;z-index:251664384;visibility:visible;mso-wrap-style:none;mso-wrap-distance-left:9pt;mso-wrap-distance-top:0;mso-wrap-distance-right:9pt;mso-wrap-distance-bottom:0;mso-position-horizontal:center;mso-position-horizontal-relative:margin;mso-position-vertical:absolute;mso-position-vertical-relative:text;v-text-anchor:top" o:gfxdata="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" filled="f" stroked="f" strokeweight=".5pt">
+            <v:shape id="文本框 4" o:spid="_x0000_s1026" type="#_x0000_t202" style="position:absolute;left:0;text-align:left;margin-left:0;margin-top:0;width:2in;height:2in;z-index:251664384;visibility:visible;mso-wrap-style:none;mso-wrap-distance-left:9pt;mso-wrap-distance-top:0;mso-wrap-distance-right:9pt;mso-wrap-distance-bottom:0;mso-position-horizontal:center;mso-position-horizontal-relative:margin;mso-position-vertical:absolute;mso-position-vertical-relative:text;v-text-anchor:top" o:gfxdata="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" filled="f" stroked="f" strokeweight=".5pt">
               <v:textbox style="mso-fit-shape-to-text:t" inset="0,0,0,0">
                 <w:txbxContent>
                   <w:p>
@@ -12239,7 +12249,7 @@
               <v:stroke joinstyle="miter"/>
               <v:path gradientshapeok="t" o:connecttype="rect"/>
             </v:shapetype>
-            <v:shape id="文本框 31" o:spid="_x0000_s1027" type="#_x0000_t202" style="position:absolute;left:0;text-align:left;margin-left:0;margin-top:0;width:2in;height:2in;z-index:251661312;visibility:visible;mso-wrap-style:none;mso-wrap-distance-left:9pt;mso-wrap-distance-top:0;mso-wrap-distance-right:9pt;mso-wrap-distance-bottom:0;mso-position-horizontal:center;mso-position-horizontal-relative:margin;mso-position-vertical:absolute;mso-position-vertical-relative:text;v-text-anchor:top" o:gfxdata="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" filled="f" stroked="f" strokeweight=".5pt">
+            <v:shape id="文本框 31" o:spid="_x0000_s1027" type="#_x0000_t202" style="position:absolute;left:0;text-align:left;margin-left:0;margin-top:0;width:2in;height:2in;z-index:251661312;visibility:visible;mso-wrap-style:none;mso-wrap-distance-left:9pt;mso-wrap-distance-top:0;mso-wrap-distance-right:9pt;mso-wrap-distance-bottom:0;mso-position-horizontal:center;mso-position-horizontal-relative:margin;mso-position-vertical:absolute;mso-position-vertical-relative:text;v-text-anchor:top" o:gfxdata="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" filled="f" stroked="f" strokeweight=".5pt">
               <v:textbox style="mso-fit-shape-to-text:t" inset="0,0,0,0">
                 <w:txbxContent>
                   <w:p>
@@ -28901,7 +28911,6 @@
   <w:style w:type="character" w:default="1" w:styleId="a0">
     <w:name w:val="Default Paragraph Font"/>
     <w:uiPriority w:val="1"/>
-    <w:semiHidden/>
     <w:unhideWhenUsed/>
   </w:style>
   <w:style w:type="table" w:default="1" w:styleId="a1">

</xml_diff>